<commit_message>
chore: pre-deployment calibration, mathematical ATS transparency, print styling, and production hardening
</commit_message>
<xml_diff>
--- a/sample_resumes/sample_ai_engineer.docx
+++ b/sample_resumes/sample_ai_engineer.docx
@@ -25,7 +25,7 @@
     </w:p>
     <w:p>
       <w:r>
-        <w:t>AI and Machine Learning Engineer with 3+ years experience building predictive systems and deep learning models.</w:t>
+        <w:t>Results-driven AI and Machine Learning Engineer with 3+ years of experience designing, evaluating, and deploying production-grade deep learning architectures, transformer pipelines, and computer vision systems. Proven track record of optimizing model inference latency, automating scalable data preprocessing pipelines, and collaborating with cross-functional software teams to integrate ML models into enterprise microservices.</w:t>
       </w:r>
     </w:p>
     <w:p>
@@ -38,7 +38,7 @@
     </w:p>
     <w:p>
       <w:r>
-        <w:t>Python, PyTorch, TensorFlow, scikit-learn, Machine Learning, Deep Learning, NLP, Computer Vision, Docker, Pandas, NumPy, Hugging Face</w:t>
+        <w:t>Python, PyTorch, TensorFlow, scikit-learn, Machine Learning, Deep Learning, NLP, Computer Vision, Docker, Pandas, NumPy, Hugging Face, Transformers, OpenCV, Feature Engineering, Data Preprocessing, MLOps</w:t>
       </w:r>
     </w:p>
     <w:p>
@@ -63,7 +63,7 @@
         <w:pStyle w:val="ListBullet"/>
       </w:pPr>
       <w:r>
-        <w:t>Engineered deep learning architectures using PyTorch and Transformers, improving inference throughput by 35%.</w:t>
+        <w:t>Architected and deployed production deep learning models using PyTorch and Hugging Face Transformers, improving inference throughput by 35% across 400,000 daily user requests.</w:t>
       </w:r>
     </w:p>
     <w:p>
@@ -71,7 +71,23 @@
         <w:pStyle w:val="ListBullet"/>
       </w:pPr>
       <w:r>
-        <w:t>Automated data preprocessing pipelines for 10TB of NLP text data, reducing feature engineering turnaround by 40%.</w:t>
+        <w:t>Automated end-to-end data preprocessing and feature engineering pipelines for 10TB of unstructured text datasets, reducing pipeline runtime by 42%.</w:t>
+      </w:r>
+    </w:p>
+    <w:p>
+      <w:pPr>
+        <w:pStyle w:val="ListBullet"/>
+      </w:pPr>
+      <w:r>
+        <w:t>Collaborated with backend engineering teams to containerize model inference servers using Docker and Kubernetes, maintaining 99.95% API uptime availability.</w:t>
+      </w:r>
+    </w:p>
+    <w:p>
+      <w:pPr>
+        <w:pStyle w:val="ListBullet"/>
+      </w:pPr>
+      <w:r>
+        <w:t>Conducted rigorous offline evaluation, A/B testing, and error analysis, reducing model hallucination rates by 24% on validation benchmarks.</w:t>
       </w:r>
     </w:p>
     <w:p>
@@ -79,7 +95,7 @@
         <w:rPr>
           <w:b/>
         </w:rPr>
-        <w:t>AI Research Intern - DeepTech Labs (2021 - 2022)</w:t>
+        <w:t>AI Research &amp; Development Intern - DeepTech Labs (2021 - 2022)</w:t>
         <w:br/>
       </w:r>
     </w:p>
@@ -88,7 +104,7 @@
         <w:pStyle w:val="ListBullet"/>
       </w:pPr>
       <w:r>
-        <w:t>Developed computer vision models with OpenCV and TensorFlow, achieving 94% classification accuracy.</w:t>
+        <w:t>Engineered real-time computer vision detection algorithms with OpenCV and TensorFlow, achieving 94.2% mean Average Precision (mAP) on edge devices.</w:t>
       </w:r>
     </w:p>
     <w:p>
@@ -96,7 +112,15 @@
         <w:pStyle w:val="ListBullet"/>
       </w:pPr>
       <w:r>
-        <w:t>Collaborated on model deployment using Docker containers and REST API endpoints.</w:t>
+        <w:t>Implemented distributed training workflows across multi-GPU clusters, accelerating model experimentation cycles by 2.5x.</w:t>
+      </w:r>
+    </w:p>
+    <w:p>
+      <w:pPr>
+        <w:pStyle w:val="ListBullet"/>
+      </w:pPr>
+      <w:r>
+        <w:t>Documented experimental findings, published technical reports, and presented prototype demonstrations to senior stakeholders.</w:t>
       </w:r>
     </w:p>
     <w:p>
@@ -112,7 +136,7 @@
         <w:rPr>
           <w:b/>
         </w:rPr>
-        <w:t>Neural Semantic Search Engine | PyTorch, Transformers, Hugging Face, Docker</w:t>
+        <w:t>Neural Semantic Search &amp; Retrieval Engine | PyTorch, Transformers, Hugging Face, Docker, FastAPI</w:t>
         <w:br/>
       </w:r>
     </w:p>
@@ -121,7 +145,7 @@
         <w:pStyle w:val="ListBullet"/>
       </w:pPr>
       <w:r>
-        <w:t>Architected semantic search retrieval serving 50,000 queries daily with sub-80ms latency.</w:t>
+        <w:t>Engineered a high-throughput semantic vector search retrieval engine indexing 2.5 million documents with sub-65ms p95 query latency.</w:t>
       </w:r>
     </w:p>
     <w:p>
@@ -129,7 +153,15 @@
         <w:pStyle w:val="ListBullet"/>
       </w:pPr>
       <w:r>
-        <w:t>Fine-tuned transformer models yielding a 22% improvement in Mean Reciprocal Rank (MRR).</w:t>
+        <w:t>Fine-tuned bi-encoder and cross-encoder transformer architectures, yielding a 22% improvement in Mean Reciprocal Rank (MRR) over keyword search baselines.</w:t>
+      </w:r>
+    </w:p>
+    <w:p>
+      <w:pPr>
+        <w:pStyle w:val="ListBullet"/>
+      </w:pPr>
+      <w:r>
+        <w:t>Containerized the FastAPI inference service with Docker and orchestrated deployment via CI/CD pipelines.</w:t>
       </w:r>
     </w:p>
     <w:p>
@@ -137,7 +169,7 @@
         <w:rPr>
           <w:b/>
         </w:rPr>
-        <w:t>Automated Medical Image Classifier | TensorFlow, scikit-learn, OpenCV, Python</w:t>
+        <w:t>Automated Medical Diagnostic Image Classifier | TensorFlow, scikit-learn, OpenCV, Python</w:t>
         <w:br/>
       </w:r>
     </w:p>
@@ -146,7 +178,15 @@
         <w:pStyle w:val="ListBullet"/>
       </w:pPr>
       <w:r>
-        <w:t>Trained convolutional neural network (CNN) on 25,000 images, reducing diagnostic false positives by 18%.</w:t>
+        <w:t>Trained convolutional neural networks (CNNs) using transfer learning on 35,000 radiological scans, achieving 96.1% diagnostic sensitivity.</w:t>
+      </w:r>
+    </w:p>
+    <w:p>
+      <w:pPr>
+        <w:pStyle w:val="ListBullet"/>
+      </w:pPr>
+      <w:r>
+        <w:t>Applied data augmentation and feature attribution heatmaps (Grad-CAM) to provide explainable model predictions for clinicians.</w:t>
       </w:r>
     </w:p>
     <w:p>
@@ -159,7 +199,7 @@
     </w:p>
     <w:p>
       <w:r>
-        <w:t>Master of Science in Computer Science (AI Track) - State University Institute (2020 - 2022)</w:t>
+        <w:t>Master of Science in Computer Science (Artificial Intelligence Specialization) - State University Institute of Technology (2020 - 2022)</w:t>
       </w:r>
     </w:p>
     <w:p>

</xml_diff>